<commit_message>
PDF R2.01 et TD2 C
</commit_message>
<xml_diff>
--- a/S2/R2.04 - Communication et fonctionnement bas niveau/TD/TD1/Rapport TD1.docx
+++ b/S2/R2.04 - Communication et fonctionnement bas niveau/TD/TD1/Rapport TD1.docx
@@ -31,14 +31,25 @@
           <w:u w:val="single"/>
         </w:rPr>
       </w:pPr>
-      <w:r>
-        <w:rPr>
-          <w:color w:val="FF0000"/>
-          <w:sz w:val="32"/>
-          <w:szCs w:val="32"/>
-          <w:u w:val="single"/>
-        </w:rPr>
-        <w:t xml:space="preserve">II ) </w:t>
+      <w:proofErr w:type="gramStart"/>
+      <w:r>
+        <w:rPr>
+          <w:color w:val="FF0000"/>
+          <w:sz w:val="32"/>
+          <w:szCs w:val="32"/>
+          <w:u w:val="single"/>
+        </w:rPr>
+        <w:t>II )</w:t>
+      </w:r>
+      <w:proofErr w:type="gramEnd"/>
+      <w:r>
+        <w:rPr>
+          <w:color w:val="FF0000"/>
+          <w:sz w:val="32"/>
+          <w:szCs w:val="32"/>
+          <w:u w:val="single"/>
+        </w:rPr>
+        <w:t xml:space="preserve"> </w:t>
       </w:r>
     </w:p>
     <w:p>
@@ -72,9 +83,56 @@
       </w:pPr>
       <w:r>
         <w:rPr>
-          <w:color w:val="000000" w:themeColor="text1"/>
-        </w:rPr>
-        <w:t>PHOTO</w:t>
+          <w:noProof/>
+        </w:rPr>
+        <w:drawing>
+          <wp:inline distT="0" distB="0" distL="0" distR="0" wp14:anchorId="3C2192A5" wp14:editId="2A01DB0F">
+            <wp:extent cx="5760720" cy="3444875"/>
+            <wp:effectExtent l="0" t="0" r="0" b="3175"/>
+            <wp:docPr id="1208546135" name="Image 1" descr="Une image contenant texte, diagramme, écriture manuscrite, ligne&#10;&#10;Description générée automatiquement"/>
+            <wp:cNvGraphicFramePr>
+              <a:graphicFrameLocks xmlns:a="http://schemas.openxmlformats.org/drawingml/2006/main" noChangeAspect="1"/>
+            </wp:cNvGraphicFramePr>
+            <a:graphic xmlns:a="http://schemas.openxmlformats.org/drawingml/2006/main">
+              <a:graphicData uri="http://schemas.openxmlformats.org/drawingml/2006/picture">
+                <pic:pic xmlns:pic="http://schemas.openxmlformats.org/drawingml/2006/picture">
+                  <pic:nvPicPr>
+                    <pic:cNvPr id="1208546135" name="Image 1" descr="Une image contenant texte, diagramme, écriture manuscrite, ligne&#10;&#10;Description générée automatiquement"/>
+                    <pic:cNvPicPr>
+                      <a:picLocks noChangeAspect="1" noChangeArrowheads="1"/>
+                    </pic:cNvPicPr>
+                  </pic:nvPicPr>
+                  <pic:blipFill>
+                    <a:blip r:embed="rId5" cstate="print">
+                      <a:extLst>
+                        <a:ext uri="{28A0092B-C50C-407E-A947-70E740481C1C}">
+                          <a14:useLocalDpi xmlns:a14="http://schemas.microsoft.com/office/drawing/2010/main" val="0"/>
+                        </a:ext>
+                      </a:extLst>
+                    </a:blip>
+                    <a:srcRect/>
+                    <a:stretch>
+                      <a:fillRect/>
+                    </a:stretch>
+                  </pic:blipFill>
+                  <pic:spPr bwMode="auto">
+                    <a:xfrm>
+                      <a:off x="0" y="0"/>
+                      <a:ext cx="5760720" cy="3444875"/>
+                    </a:xfrm>
+                    <a:prstGeom prst="rect">
+                      <a:avLst/>
+                    </a:prstGeom>
+                    <a:noFill/>
+                    <a:ln>
+                      <a:noFill/>
+                    </a:ln>
+                  </pic:spPr>
+                </pic:pic>
+              </a:graphicData>
+            </a:graphic>
+          </wp:inline>
+        </w:drawing>
       </w:r>
     </w:p>
     <w:p>
@@ -111,13 +169,105 @@
           <w:u w:val="single"/>
         </w:rPr>
       </w:pPr>
-      <w:r>
-        <w:rPr>
-          <w:color w:val="FF0000"/>
-          <w:sz w:val="32"/>
-          <w:szCs w:val="32"/>
-          <w:u w:val="single"/>
-        </w:rPr>
+    </w:p>
+    <w:p>
+      <w:pPr>
+        <w:rPr>
+          <w:color w:val="FF0000"/>
+          <w:sz w:val="32"/>
+          <w:szCs w:val="32"/>
+          <w:u w:val="single"/>
+        </w:rPr>
+      </w:pPr>
+    </w:p>
+    <w:p>
+      <w:pPr>
+        <w:rPr>
+          <w:color w:val="FF0000"/>
+          <w:sz w:val="32"/>
+          <w:szCs w:val="32"/>
+          <w:u w:val="single"/>
+        </w:rPr>
+      </w:pPr>
+    </w:p>
+    <w:p>
+      <w:pPr>
+        <w:rPr>
+          <w:color w:val="FF0000"/>
+          <w:sz w:val="32"/>
+          <w:szCs w:val="32"/>
+          <w:u w:val="single"/>
+        </w:rPr>
+      </w:pPr>
+    </w:p>
+    <w:p>
+      <w:pPr>
+        <w:rPr>
+          <w:color w:val="FF0000"/>
+          <w:sz w:val="32"/>
+          <w:szCs w:val="32"/>
+          <w:u w:val="single"/>
+        </w:rPr>
+      </w:pPr>
+    </w:p>
+    <w:p>
+      <w:pPr>
+        <w:rPr>
+          <w:color w:val="FF0000"/>
+          <w:sz w:val="32"/>
+          <w:szCs w:val="32"/>
+          <w:u w:val="single"/>
+        </w:rPr>
+      </w:pPr>
+    </w:p>
+    <w:p>
+      <w:pPr>
+        <w:rPr>
+          <w:color w:val="FF0000"/>
+          <w:sz w:val="32"/>
+          <w:szCs w:val="32"/>
+          <w:u w:val="single"/>
+        </w:rPr>
+      </w:pPr>
+    </w:p>
+    <w:p>
+      <w:pPr>
+        <w:rPr>
+          <w:color w:val="FF0000"/>
+          <w:sz w:val="32"/>
+          <w:szCs w:val="32"/>
+          <w:u w:val="single"/>
+        </w:rPr>
+      </w:pPr>
+    </w:p>
+    <w:p>
+      <w:pPr>
+        <w:rPr>
+          <w:color w:val="FF0000"/>
+          <w:sz w:val="32"/>
+          <w:szCs w:val="32"/>
+          <w:u w:val="single"/>
+        </w:rPr>
+      </w:pPr>
+    </w:p>
+    <w:p>
+      <w:pPr>
+        <w:rPr>
+          <w:color w:val="FF0000"/>
+          <w:sz w:val="32"/>
+          <w:szCs w:val="32"/>
+          <w:u w:val="single"/>
+        </w:rPr>
+      </w:pPr>
+      <w:proofErr w:type="gramStart"/>
+      <w:r>
+        <w:rPr>
+          <w:color w:val="FF0000"/>
+          <w:sz w:val="32"/>
+          <w:szCs w:val="32"/>
+          <w:u w:val="single"/>
+        </w:rPr>
+        <w:lastRenderedPageBreak/>
         <w:t>II</w:t>
       </w:r>
       <w:r>
@@ -136,7 +286,17 @@
           <w:szCs w:val="32"/>
           <w:u w:val="single"/>
         </w:rPr>
-        <w:t xml:space="preserve"> ) </w:t>
+        <w:t xml:space="preserve"> )</w:t>
+      </w:r>
+      <w:proofErr w:type="gramEnd"/>
+      <w:r>
+        <w:rPr>
+          <w:color w:val="FF0000"/>
+          <w:sz w:val="32"/>
+          <w:szCs w:val="32"/>
+          <w:u w:val="single"/>
+        </w:rPr>
+        <w:t xml:space="preserve"> </w:t>
       </w:r>
     </w:p>
     <w:p>
@@ -170,9 +330,59 @@
       </w:pPr>
       <w:r>
         <w:rPr>
-          <w:color w:val="000000" w:themeColor="text1"/>
-        </w:rPr>
-        <w:t>PHOTO</w:t>
+          <w:noProof/>
+        </w:rPr>
+        <w:drawing>
+          <wp:inline distT="0" distB="0" distL="0" distR="0" wp14:anchorId="4212E226" wp14:editId="7625FA57">
+            <wp:extent cx="5406390" cy="6706553"/>
+            <wp:effectExtent l="0" t="2223" r="1588" b="1587"/>
+            <wp:docPr id="1045330317" name="Image 2" descr="Une image contenant texte, diagramme, dessin, Dessin technique&#10;&#10;Description générée automatiquement"/>
+            <wp:cNvGraphicFramePr>
+              <a:graphicFrameLocks xmlns:a="http://schemas.openxmlformats.org/drawingml/2006/main" noChangeAspect="1"/>
+            </wp:cNvGraphicFramePr>
+            <a:graphic xmlns:a="http://schemas.openxmlformats.org/drawingml/2006/main">
+              <a:graphicData uri="http://schemas.openxmlformats.org/drawingml/2006/picture">
+                <pic:pic xmlns:pic="http://schemas.openxmlformats.org/drawingml/2006/picture">
+                  <pic:nvPicPr>
+                    <pic:cNvPr id="1045330317" name="Image 2" descr="Une image contenant texte, diagramme, dessin, Dessin technique&#10;&#10;Description générée automatiquement"/>
+                    <pic:cNvPicPr>
+                      <a:picLocks noChangeAspect="1" noChangeArrowheads="1"/>
+                    </pic:cNvPicPr>
+                  </pic:nvPicPr>
+                  <pic:blipFill rotWithShape="1">
+                    <a:blip r:embed="rId6" cstate="print">
+                      <a:extLst>
+                        <a:ext uri="{28A0092B-C50C-407E-A947-70E740481C1C}">
+                          <a14:useLocalDpi xmlns:a14="http://schemas.microsoft.com/office/drawing/2010/main" val="0"/>
+                        </a:ext>
+                      </a:extLst>
+                    </a:blip>
+                    <a:srcRect t="24582"/>
+                    <a:stretch/>
+                  </pic:blipFill>
+                  <pic:spPr bwMode="auto">
+                    <a:xfrm rot="16200000">
+                      <a:off x="0" y="0"/>
+                      <a:ext cx="5406390" cy="6706553"/>
+                    </a:xfrm>
+                    <a:prstGeom prst="rect">
+                      <a:avLst/>
+                    </a:prstGeom>
+                    <a:noFill/>
+                    <a:ln>
+                      <a:noFill/>
+                    </a:ln>
+                    <a:extLst>
+                      <a:ext uri="{53640926-AAD7-44D8-BBD7-CCE9431645EC}">
+                        <a14:shadowObscured xmlns:a14="http://schemas.microsoft.com/office/drawing/2010/main"/>
+                      </a:ext>
+                    </a:extLst>
+                  </pic:spPr>
+                </pic:pic>
+              </a:graphicData>
+            </a:graphic>
+          </wp:inline>
+        </w:drawing>
       </w:r>
     </w:p>
     <w:p>
@@ -209,6 +419,77 @@
           <w:u w:val="single"/>
         </w:rPr>
       </w:pPr>
+    </w:p>
+    <w:p>
+      <w:pPr>
+        <w:rPr>
+          <w:color w:val="FF0000"/>
+          <w:sz w:val="32"/>
+          <w:szCs w:val="32"/>
+          <w:u w:val="single"/>
+        </w:rPr>
+      </w:pPr>
+    </w:p>
+    <w:p>
+      <w:pPr>
+        <w:rPr>
+          <w:color w:val="FF0000"/>
+          <w:sz w:val="32"/>
+          <w:szCs w:val="32"/>
+          <w:u w:val="single"/>
+        </w:rPr>
+      </w:pPr>
+    </w:p>
+    <w:p>
+      <w:pPr>
+        <w:rPr>
+          <w:color w:val="FF0000"/>
+          <w:sz w:val="32"/>
+          <w:szCs w:val="32"/>
+          <w:u w:val="single"/>
+        </w:rPr>
+      </w:pPr>
+    </w:p>
+    <w:p>
+      <w:pPr>
+        <w:rPr>
+          <w:color w:val="FF0000"/>
+          <w:sz w:val="32"/>
+          <w:szCs w:val="32"/>
+          <w:u w:val="single"/>
+        </w:rPr>
+      </w:pPr>
+    </w:p>
+    <w:p>
+      <w:pPr>
+        <w:rPr>
+          <w:color w:val="FF0000"/>
+          <w:sz w:val="32"/>
+          <w:szCs w:val="32"/>
+          <w:u w:val="single"/>
+        </w:rPr>
+      </w:pPr>
+    </w:p>
+    <w:p>
+      <w:pPr>
+        <w:rPr>
+          <w:color w:val="FF0000"/>
+          <w:sz w:val="32"/>
+          <w:szCs w:val="32"/>
+          <w:u w:val="single"/>
+        </w:rPr>
+      </w:pPr>
+    </w:p>
+    <w:p>
+      <w:pPr>
+        <w:rPr>
+          <w:color w:val="FF0000"/>
+          <w:sz w:val="32"/>
+          <w:szCs w:val="32"/>
+          <w:u w:val="single"/>
+        </w:rPr>
+      </w:pPr>
+      <w:proofErr w:type="gramStart"/>
       <w:r>
         <w:rPr>
           <w:color w:val="FF0000"/>
@@ -234,7 +515,17 @@
           <w:szCs w:val="32"/>
           <w:u w:val="single"/>
         </w:rPr>
-        <w:t xml:space="preserve"> ) </w:t>
+        <w:t xml:space="preserve"> )</w:t>
+      </w:r>
+      <w:proofErr w:type="gramEnd"/>
+      <w:r>
+        <w:rPr>
+          <w:color w:val="FF0000"/>
+          <w:sz w:val="32"/>
+          <w:szCs w:val="32"/>
+          <w:u w:val="single"/>
+        </w:rPr>
+        <w:t xml:space="preserve"> </w:t>
       </w:r>
     </w:p>
     <w:p>
@@ -282,9 +573,59 @@
       </w:pPr>
       <w:r>
         <w:rPr>
-          <w:color w:val="000000" w:themeColor="text1"/>
-        </w:rPr>
-        <w:t>PHOTO</w:t>
+          <w:noProof/>
+        </w:rPr>
+        <w:drawing>
+          <wp:inline distT="0" distB="0" distL="0" distR="0" wp14:anchorId="2FBAF81C" wp14:editId="5DB4A4DF">
+            <wp:extent cx="5760489" cy="4876800"/>
+            <wp:effectExtent l="3493" t="0" r="0" b="0"/>
+            <wp:docPr id="528435852" name="Image 3" descr="Une image contenant texte, diagramme, ligne, écriture manuscrite&#10;&#10;Description générée automatiquement"/>
+            <wp:cNvGraphicFramePr>
+              <a:graphicFrameLocks xmlns:a="http://schemas.openxmlformats.org/drawingml/2006/main" noChangeAspect="1"/>
+            </wp:cNvGraphicFramePr>
+            <a:graphic xmlns:a="http://schemas.openxmlformats.org/drawingml/2006/main">
+              <a:graphicData uri="http://schemas.openxmlformats.org/drawingml/2006/picture">
+                <pic:pic xmlns:pic="http://schemas.openxmlformats.org/drawingml/2006/picture">
+                  <pic:nvPicPr>
+                    <pic:cNvPr id="528435852" name="Image 3" descr="Une image contenant texte, diagramme, ligne, écriture manuscrite&#10;&#10;Description générée automatiquement"/>
+                    <pic:cNvPicPr>
+                      <a:picLocks noChangeAspect="1" noChangeArrowheads="1"/>
+                    </pic:cNvPicPr>
+                  </pic:nvPicPr>
+                  <pic:blipFill rotWithShape="1">
+                    <a:blip r:embed="rId7" cstate="print">
+                      <a:extLst>
+                        <a:ext uri="{28A0092B-C50C-407E-A947-70E740481C1C}">
+                          <a14:useLocalDpi xmlns:a14="http://schemas.microsoft.com/office/drawing/2010/main" val="0"/>
+                        </a:ext>
+                      </a:extLst>
+                    </a:blip>
+                    <a:srcRect l="189" t="19005" r="-189" b="22673"/>
+                    <a:stretch/>
+                  </pic:blipFill>
+                  <pic:spPr bwMode="auto">
+                    <a:xfrm rot="16200000">
+                      <a:off x="0" y="0"/>
+                      <a:ext cx="5760720" cy="4876995"/>
+                    </a:xfrm>
+                    <a:prstGeom prst="rect">
+                      <a:avLst/>
+                    </a:prstGeom>
+                    <a:noFill/>
+                    <a:ln>
+                      <a:noFill/>
+                    </a:ln>
+                    <a:extLst>
+                      <a:ext uri="{53640926-AAD7-44D8-BBD7-CCE9431645EC}">
+                        <a14:shadowObscured xmlns:a14="http://schemas.microsoft.com/office/drawing/2010/main"/>
+                      </a:ext>
+                    </a:extLst>
+                  </pic:spPr>
+                </pic:pic>
+              </a:graphicData>
+            </a:graphic>
+          </wp:inline>
+        </w:drawing>
       </w:r>
     </w:p>
     <w:p>
@@ -310,6 +651,7 @@
       </w:pPr>
       <w:r>
         <w:rPr>
+          <w:noProof/>
           <w:color w:val="000000" w:themeColor="text1"/>
           <w:u w:val="single"/>
         </w:rPr>
@@ -329,7 +671,7 @@
                     <pic:cNvPicPr/>
                   </pic:nvPicPr>
                   <pic:blipFill>
-                    <a:blip r:embed="rId5"/>
+                    <a:blip r:embed="rId8"/>
                     <a:stretch>
                       <a:fillRect/>
                     </a:stretch>
@@ -366,14 +708,36 @@
           <w:u w:val="single"/>
         </w:rPr>
       </w:pPr>
-      <w:r>
-        <w:rPr>
-          <w:color w:val="FF0000"/>
-          <w:sz w:val="32"/>
-          <w:szCs w:val="32"/>
-          <w:u w:val="single"/>
-        </w:rPr>
-        <w:t xml:space="preserve">V ) </w:t>
+    </w:p>
+    <w:p>
+      <w:pPr>
+        <w:rPr>
+          <w:color w:val="FF0000"/>
+          <w:sz w:val="32"/>
+          <w:szCs w:val="32"/>
+          <w:u w:val="single"/>
+        </w:rPr>
+      </w:pPr>
+      <w:proofErr w:type="gramStart"/>
+      <w:r>
+        <w:rPr>
+          <w:color w:val="FF0000"/>
+          <w:sz w:val="32"/>
+          <w:szCs w:val="32"/>
+          <w:u w:val="single"/>
+        </w:rPr>
+        <w:lastRenderedPageBreak/>
+        <w:t>V )</w:t>
+      </w:r>
+      <w:proofErr w:type="gramEnd"/>
+      <w:r>
+        <w:rPr>
+          <w:color w:val="FF0000"/>
+          <w:sz w:val="32"/>
+          <w:szCs w:val="32"/>
+          <w:u w:val="single"/>
+        </w:rPr>
+        <w:t xml:space="preserve"> </w:t>
       </w:r>
     </w:p>
     <w:p>
@@ -391,22 +755,22 @@
         <w:rPr>
           <w:color w:val="000000" w:themeColor="text1"/>
         </w:rPr>
-        <w:t>Il ne se passe aucun changement avant et après car la fonction n’utilise ni de return ni de pointeur pour renvoyer les valeurs modifiées. Donc l’affichage est identiques</w:t>
-      </w:r>
-      <w:r>
-        <w:rPr>
-          <w:color w:val="000000" w:themeColor="text1"/>
-        </w:rPr>
-        <w:t xml:space="preserve"> (PHOTO)</w:t>
-      </w:r>
-    </w:p>
-    <w:p>
-      <w:pPr>
-        <w:pStyle w:val="Paragraphedeliste"/>
-        <w:rPr>
-          <w:color w:val="000000" w:themeColor="text1"/>
-        </w:rPr>
-      </w:pPr>
+        <w:t xml:space="preserve">Il ne se passe aucun changement avant et après car la fonction n’utilise ni de return ni de pointeur pour renvoyer les valeurs modifiées. Donc l’affichage est </w:t>
+      </w:r>
+      <w:proofErr w:type="gramStart"/>
+      <w:r>
+        <w:rPr>
+          <w:color w:val="000000" w:themeColor="text1"/>
+        </w:rPr>
+        <w:t>identiques</w:t>
+      </w:r>
+      <w:proofErr w:type="gramEnd"/>
+      <w:r>
+        <w:rPr>
+          <w:color w:val="000000" w:themeColor="text1"/>
+        </w:rPr>
+        <w:t xml:space="preserve"> </w:t>
+      </w:r>
     </w:p>
     <w:p>
       <w:pPr>
@@ -421,6 +785,75 @@
       </w:pPr>
       <w:r>
         <w:rPr>
+          <w:noProof/>
+        </w:rPr>
+        <w:drawing>
+          <wp:inline distT="0" distB="0" distL="0" distR="0" wp14:anchorId="2E39AE12" wp14:editId="0DFA7DB1">
+            <wp:extent cx="5760137" cy="3842657"/>
+            <wp:effectExtent l="6350" t="0" r="0" b="0"/>
+            <wp:docPr id="280342120" name="Image 4" descr="Une image contenant texte, diagramme, Plan, schématique&#10;&#10;Description générée automatiquement"/>
+            <wp:cNvGraphicFramePr>
+              <a:graphicFrameLocks xmlns:a="http://schemas.openxmlformats.org/drawingml/2006/main" noChangeAspect="1"/>
+            </wp:cNvGraphicFramePr>
+            <a:graphic xmlns:a="http://schemas.openxmlformats.org/drawingml/2006/main">
+              <a:graphicData uri="http://schemas.openxmlformats.org/drawingml/2006/picture">
+                <pic:pic xmlns:pic="http://schemas.openxmlformats.org/drawingml/2006/picture">
+                  <pic:nvPicPr>
+                    <pic:cNvPr id="280342120" name="Image 4" descr="Une image contenant texte, diagramme, Plan, schématique&#10;&#10;Description générée automatiquement"/>
+                    <pic:cNvPicPr>
+                      <a:picLocks noChangeAspect="1" noChangeArrowheads="1"/>
+                    </pic:cNvPicPr>
+                  </pic:nvPicPr>
+                  <pic:blipFill rotWithShape="1">
+                    <a:blip r:embed="rId9" cstate="print">
+                      <a:extLst>
+                        <a:ext uri="{28A0092B-C50C-407E-A947-70E740481C1C}">
+                          <a14:useLocalDpi xmlns:a14="http://schemas.microsoft.com/office/drawing/2010/main" val="0"/>
+                        </a:ext>
+                      </a:extLst>
+                    </a:blip>
+                    <a:srcRect t="17680" b="23436"/>
+                    <a:stretch/>
+                  </pic:blipFill>
+                  <pic:spPr bwMode="auto">
+                    <a:xfrm rot="16200000">
+                      <a:off x="0" y="0"/>
+                      <a:ext cx="5760720" cy="3843046"/>
+                    </a:xfrm>
+                    <a:prstGeom prst="rect">
+                      <a:avLst/>
+                    </a:prstGeom>
+                    <a:noFill/>
+                    <a:ln>
+                      <a:noFill/>
+                    </a:ln>
+                    <a:extLst>
+                      <a:ext uri="{53640926-AAD7-44D8-BBD7-CCE9431645EC}">
+                        <a14:shadowObscured xmlns:a14="http://schemas.microsoft.com/office/drawing/2010/main"/>
+                      </a:ext>
+                    </a:extLst>
+                  </pic:spPr>
+                </pic:pic>
+              </a:graphicData>
+            </a:graphic>
+          </wp:inline>
+        </w:drawing>
+      </w:r>
+    </w:p>
+    <w:p>
+      <w:pPr>
+        <w:pStyle w:val="Paragraphedeliste"/>
+        <w:numPr>
+          <w:ilvl w:val="0"/>
+          <w:numId w:val="5"/>
+        </w:numPr>
+        <w:rPr>
+          <w:color w:val="000000" w:themeColor="text1"/>
+        </w:rPr>
+      </w:pPr>
+      <w:r>
+        <w:rPr>
+          <w:noProof/>
           <w:color w:val="000000" w:themeColor="text1"/>
         </w:rPr>
         <w:drawing>
@@ -439,7 +872,7 @@
                     <pic:cNvPicPr/>
                   </pic:nvPicPr>
                   <pic:blipFill>
-                    <a:blip r:embed="rId6"/>
+                    <a:blip r:embed="rId10"/>
                     <a:stretch>
                       <a:fillRect/>
                     </a:stretch>
@@ -492,15 +925,29 @@
     <w:p>
       <w:pPr>
         <w:rPr>
-          <w:color w:val="000000" w:themeColor="text1"/>
-        </w:rPr>
-      </w:pPr>
-      <w:r>
-        <w:rPr>
-          <w:color w:val="000000" w:themeColor="text1"/>
+          <w:color w:val="FF0000"/>
+          <w:sz w:val="32"/>
+          <w:szCs w:val="32"/>
+        </w:rPr>
+      </w:pPr>
+      <w:proofErr w:type="gramStart"/>
+      <w:r>
+        <w:rPr>
+          <w:color w:val="FF0000"/>
+          <w:sz w:val="32"/>
+          <w:szCs w:val="32"/>
         </w:rPr>
         <w:lastRenderedPageBreak/>
-        <w:t xml:space="preserve">VI ) </w:t>
+        <w:t>VI )</w:t>
+      </w:r>
+      <w:proofErr w:type="gramEnd"/>
+      <w:r>
+        <w:rPr>
+          <w:color w:val="FF0000"/>
+          <w:sz w:val="32"/>
+          <w:szCs w:val="32"/>
+        </w:rPr>
+        <w:t xml:space="preserve"> </w:t>
       </w:r>
     </w:p>
     <w:p>
@@ -516,10 +963,67 @@
       </w:pPr>
       <w:r>
         <w:rPr>
-          <w:color w:val="000000" w:themeColor="text1"/>
-        </w:rPr>
-        <w:t>PHOTO</w:t>
-      </w:r>
+          <w:noProof/>
+        </w:rPr>
+        <w:drawing>
+          <wp:inline distT="0" distB="0" distL="0" distR="0" wp14:anchorId="15F3E9BF" wp14:editId="520B1391">
+            <wp:extent cx="5226050" cy="7249886"/>
+            <wp:effectExtent l="0" t="0" r="0" b="8255"/>
+            <wp:docPr id="1714111806" name="Image 5" descr="Une image contenant texte, diagramme, Plan, schématique&#10;&#10;Description générée automatiquement"/>
+            <wp:cNvGraphicFramePr>
+              <a:graphicFrameLocks xmlns:a="http://schemas.openxmlformats.org/drawingml/2006/main" noChangeAspect="1"/>
+            </wp:cNvGraphicFramePr>
+            <a:graphic xmlns:a="http://schemas.openxmlformats.org/drawingml/2006/main">
+              <a:graphicData uri="http://schemas.openxmlformats.org/drawingml/2006/picture">
+                <pic:pic xmlns:pic="http://schemas.openxmlformats.org/drawingml/2006/picture">
+                  <pic:nvPicPr>
+                    <pic:cNvPr id="1714111806" name="Image 5" descr="Une image contenant texte, diagramme, Plan, schématique&#10;&#10;Description générée automatiquement"/>
+                    <pic:cNvPicPr>
+                      <a:picLocks noChangeAspect="1" noChangeArrowheads="1"/>
+                    </pic:cNvPicPr>
+                  </pic:nvPicPr>
+                  <pic:blipFill rotWithShape="1">
+                    <a:blip r:embed="rId11" cstate="print">
+                      <a:extLst>
+                        <a:ext uri="{28A0092B-C50C-407E-A947-70E740481C1C}">
+                          <a14:useLocalDpi xmlns:a14="http://schemas.microsoft.com/office/drawing/2010/main" val="0"/>
+                        </a:ext>
+                      </a:extLst>
+                    </a:blip>
+                    <a:srcRect b="18473"/>
+                    <a:stretch/>
+                  </pic:blipFill>
+                  <pic:spPr bwMode="auto">
+                    <a:xfrm>
+                      <a:off x="0" y="0"/>
+                      <a:ext cx="5226050" cy="7249886"/>
+                    </a:xfrm>
+                    <a:prstGeom prst="rect">
+                      <a:avLst/>
+                    </a:prstGeom>
+                    <a:noFill/>
+                    <a:ln>
+                      <a:noFill/>
+                    </a:ln>
+                    <a:extLst>
+                      <a:ext uri="{53640926-AAD7-44D8-BBD7-CCE9431645EC}">
+                        <a14:shadowObscured xmlns:a14="http://schemas.microsoft.com/office/drawing/2010/main"/>
+                      </a:ext>
+                    </a:extLst>
+                  </pic:spPr>
+                </pic:pic>
+              </a:graphicData>
+            </a:graphic>
+          </wp:inline>
+        </w:drawing>
+      </w:r>
+    </w:p>
+    <w:p>
+      <w:pPr>
+        <w:rPr>
+          <w:color w:val="000000" w:themeColor="text1"/>
+        </w:rPr>
+      </w:pPr>
     </w:p>
     <w:p>
       <w:pPr>
@@ -534,8 +1038,10 @@
       </w:pPr>
       <w:r>
         <w:rPr>
-          <w:color w:val="000000" w:themeColor="text1"/>
-        </w:rPr>
+          <w:noProof/>
+          <w:color w:val="000000" w:themeColor="text1"/>
+        </w:rPr>
+        <w:lastRenderedPageBreak/>
         <w:drawing>
           <wp:inline distT="0" distB="0" distL="0" distR="0" wp14:anchorId="3FA0A74D" wp14:editId="397B4061">
             <wp:extent cx="5760720" cy="2097405"/>
@@ -552,7 +1058,7 @@
                     <pic:cNvPicPr/>
                   </pic:nvPicPr>
                   <pic:blipFill>
-                    <a:blip r:embed="rId7"/>
+                    <a:blip r:embed="rId12"/>
                     <a:stretch>
                       <a:fillRect/>
                     </a:stretch>
@@ -1751,6 +2257,7 @@
   <w:style w:type="character" w:default="1" w:styleId="Policepardfaut">
     <w:name w:val="Default Paragraph Font"/>
     <w:uiPriority w:val="1"/>
+    <w:semiHidden/>
     <w:unhideWhenUsed/>
   </w:style>
   <w:style w:type="table" w:default="1" w:styleId="TableauNormal">

</xml_diff>